<commit_message>
style: aplicar correcciones metodologicas de tutoria en Cap I, II y III
</commit_message>
<xml_diff>
--- a/proyecto_de_grado/Instrumento_y_Validacion_Expertos.docx
+++ b/proyecto_de_grado/Instrumento_y_Validacion_Expertos.docx
@@ -632,16 +632,13 @@
             </w:tcMar>
           </w:tcPr>
           <w:p>
-            <w:pPr>
-              <w:spacing w:after="40"/>
-              <w:jc w:val="left"/>
-            </w:pPr>
+            <w:r/>
             <w:r>
               <w:rPr>
                 <w:rFonts w:ascii="Times New Roman" w:hAnsi="Times New Roman"/>
-                <w:sz w:val="18"/>
+                <w:sz w:val="20"/>
               </w:rPr>
-              <w:t>Diagnosticar el flujo actual de los datos registrados en hojas de Excel.</w:t>
+              <w:t>Diagnosticar el estado de registro, control de inventario y atención al cliente.</w:t>
             </w:r>
           </w:p>
         </w:tc>
@@ -828,16 +825,13 @@
             </w:tcMar>
           </w:tcPr>
           <w:p>
-            <w:pPr>
-              <w:spacing w:after="40"/>
-              <w:jc w:val="left"/>
-            </w:pPr>
+            <w:r/>
             <w:r>
               <w:rPr>
                 <w:rFonts w:ascii="Times New Roman" w:hAnsi="Times New Roman"/>
-                <w:sz w:val="18"/>
+                <w:sz w:val="20"/>
               </w:rPr>
-              <w:t>Determinar los requerimientos funcionales para la automatización.</w:t>
+              <w:t>Determinar los requerimientos técnicos y funcionales del sistema propuesto.</w:t>
             </w:r>
           </w:p>
         </w:tc>
@@ -1024,16 +1018,13 @@
             </w:tcMar>
           </w:tcPr>
           <w:p>
-            <w:pPr>
-              <w:spacing w:after="40"/>
-              <w:jc w:val="left"/>
-            </w:pPr>
+            <w:r/>
             <w:r>
               <w:rPr>
                 <w:rFonts w:ascii="Times New Roman" w:hAnsi="Times New Roman"/>
-                <w:sz w:val="18"/>
+                <w:sz w:val="20"/>
               </w:rPr>
-              <w:t>Diseñar la arquitectura de base de datos e interfaces.</w:t>
+              <w:t>Diseñar la arquitectura lógica, base de datos relacional e interfaces.</w:t>
             </w:r>
           </w:p>
         </w:tc>
@@ -1220,16 +1211,13 @@
             </w:tcMar>
           </w:tcPr>
           <w:p>
-            <w:pPr>
-              <w:spacing w:after="40"/>
-              <w:jc w:val="left"/>
-            </w:pPr>
+            <w:r/>
             <w:r>
               <w:rPr>
                 <w:rFonts w:ascii="Times New Roman" w:hAnsi="Times New Roman"/>
-                <w:sz w:val="18"/>
+                <w:sz w:val="20"/>
               </w:rPr>
-              <w:t>Desarrollar módulos de registro y reportes automatizados.</w:t>
+              <w:t>Desarrollar e implementar el sistema de información propuesto.</w:t>
             </w:r>
           </w:p>
         </w:tc>

</xml_diff>